<commit_message>
Add Deliverable 4 presentation deep-dive guide and demo assets.
Document explains every slide in the 8-minute handout (ERD, reflection,
Q16/Q18 SQL and screenshots). Update pptx with embedded demo results,
spy-schema homework SQL helpers, and Homework 4 docx alignment.

Co-authored-by: Cursor <cursoragent@cursor.com>
</commit_message>
<xml_diff>
--- a/CS 486_586 – Homework 4-emmanart.docx
+++ b/CS 486_586 – Homework 4-emmanart.docx
@@ -1803,7 +1803,7 @@
           <w:rFonts w:ascii="Calibri" w:hAnsi="Calibri"/>
           <w:sz w:val="22"/>
         </w:rPr>
-        <w:t>SQL (subquery):</w:t>
+        <w:t>SQL (subquery) — spy.team (team_id, name) from ERD:</w:t>
       </w:r>
     </w:p>
     <w:p>
@@ -1821,7 +1821,7 @@
           <w:rFonts w:ascii="Consolas" w:hAnsi="Consolas"/>
           <w:sz w:val="18"/>
         </w:rPr>
-        <w:t>FROM team</w:t>
+        <w:t>FROM spy.team</w:t>
       </w:r>
     </w:p>
     <w:p>
@@ -1848,7 +1848,7 @@
           <w:rFonts w:ascii="Consolas" w:hAnsi="Consolas"/>
           <w:sz w:val="18"/>
         </w:rPr>
-        <w:t xml:space="preserve">  FROM team</w:t>
+        <w:t xml:space="preserve">  FROM spy.team</w:t>
       </w:r>
     </w:p>
     <w:p>
@@ -1863,8 +1863,8 @@
     <w:p>
       <w:r>
         <w:rPr>
-          <w:rFonts w:ascii="Consolas" w:hAnsi="Consolas"/>
-          <w:sz w:val="18"/>
+          <w:rFonts w:ascii="Calibri" w:hAnsi="Calibri"/>
+          <w:sz w:val="22"/>
         </w:rPr>
       </w:r>
     </w:p>
@@ -1905,11 +1905,11 @@
       <w:r>
         <w:rPr>
           <w:rFonts w:ascii="Calibri" w:cs="Calibri" w:eastAsia="Calibri" w:hAnsi="Calibri"/>
-          <w:sz w:val="24"/>
-          <w:szCs w:val="24"/>
-          <w:rtl w:val="0"/>
-        </w:rPr>
-        <w:t xml:space="preserve">List the first and last names of agents who have been on a </w:t>
+          <w:sz w:val="22"/>
+          <w:szCs w:val="24"/>
+          <w:rtl w:val="0"/>
+        </w:rPr>
+        <w:t>Answer 7:</w:t>
       </w:r>
       <w:r>
         <w:rPr>
@@ -1920,50 +1920,31 @@
           <w:szCs w:val="24"/>
           <w:rtl w:val="0"/>
         </w:rPr>
-        <w:t xml:space="preserve">Top Secret</w:t>
-      </w:r>
-      <w:r>
-        <w:rPr>
-          <w:rFonts w:ascii="Calibri" w:cs="Calibri" w:eastAsia="Calibri" w:hAnsi="Calibri"/>
-          <w:sz w:val="24"/>
-          <w:szCs w:val="24"/>
-          <w:rtl w:val="0"/>
-        </w:rPr>
-        <w:t xml:space="preserve"> mission that failed.</w:t>
-      </w:r>
-    </w:p>
-    <w:p>
-      <w:r>
-        <w:rPr>
-          <w:rFonts w:ascii="Calibri" w:hAnsi="Calibri"/>
-          <w:sz w:val="22"/>
-        </w:rPr>
-      </w:r>
-    </w:p>
-    <w:p>
-      <w:r>
-        <w:rPr>
-          <w:rFonts w:ascii="Calibri" w:hAnsi="Calibri"/>
+      </w:r>
+      <w:r>
+        <w:rPr>
+          <w:rFonts w:ascii="Calibri" w:cs="Calibri" w:eastAsia="Calibri" w:hAnsi="Calibri"/>
+          <w:sz w:val="24"/>
+          <w:szCs w:val="24"/>
+          <w:rtl w:val="0"/>
+        </w:rPr>
+      </w:r>
+    </w:p>
+    <w:p>
+      <w:r>
+        <w:rPr>
+          <w:rFonts w:ascii="Calibri" w:hAnsi="Calibri"/>
+          <w:sz w:val="22"/>
+        </w:rPr>
+        <w:t>SQL (subquery) — spy schema from ERD: spy.agent -&gt; spy.teamrel -&gt; spy.team &lt;- spy.mission; spy.mission.access_id -&gt; spy.securityclearance:</w:t>
+      </w:r>
+    </w:p>
+    <w:p>
+      <w:r>
+        <w:rPr>
+          <w:rFonts w:ascii="Consolas" w:hAnsi="Consolas"/>
           <w:b/>
-          <w:sz w:val="22"/>
-        </w:rPr>
-        <w:t>Answer 7:</w:t>
-      </w:r>
-    </w:p>
-    <w:p>
-      <w:r>
-        <w:rPr>
-          <w:rFonts w:ascii="Calibri" w:hAnsi="Calibri"/>
-          <w:sz w:val="22"/>
-        </w:rPr>
-        <w:t>SQL (subquery): Agents on a mission are on that mission's team (teamrel links agent to team; mission has team_id).</w:t>
-      </w:r>
-    </w:p>
-    <w:p>
-      <w:r>
-        <w:rPr>
-          <w:rFonts w:ascii="Calibri" w:hAnsi="Calibri"/>
-          <w:sz w:val="22"/>
+          <w:sz w:val="18"/>
         </w:rPr>
         <w:t>SELECT DISTINCT a.first, a.last</w:t>
       </w:r>
@@ -1974,7 +1955,7 @@
           <w:rFonts w:ascii="Consolas" w:hAnsi="Consolas"/>
           <w:sz w:val="18"/>
         </w:rPr>
-        <w:t>FROM agent a</w:t>
+        <w:t>FROM spy.agent AS a</w:t>
       </w:r>
     </w:p>
     <w:p>
@@ -2001,7 +1982,7 @@
           <w:rFonts w:ascii="Consolas" w:hAnsi="Consolas"/>
           <w:sz w:val="18"/>
         </w:rPr>
-        <w:t xml:space="preserve">  FROM teamrel tr</w:t>
+        <w:t xml:space="preserve">  FROM spy.teamrel AS tr</w:t>
       </w:r>
     </w:p>
     <w:p>
@@ -2028,68 +2009,50 @@
           <w:rFonts w:ascii="Consolas" w:hAnsi="Consolas"/>
           <w:sz w:val="18"/>
         </w:rPr>
-        <w:t xml:space="preserve">    FROM mission m</w:t>
-      </w:r>
-    </w:p>
-    <w:p>
-      <w:r>
-        <w:rPr>
-          <w:rFonts w:ascii="Consolas" w:hAnsi="Consolas"/>
-          <w:sz w:val="18"/>
-        </w:rPr>
-        <w:t xml:space="preserve">    WHERE m.access_id IN (</w:t>
-      </w:r>
-    </w:p>
-    <w:p>
-      <w:r>
-        <w:rPr>
-          <w:rFonts w:ascii="Consolas" w:hAnsi="Consolas"/>
-          <w:sz w:val="18"/>
-        </w:rPr>
-        <w:t xml:space="preserve">      SELECT sc_id</w:t>
-      </w:r>
-    </w:p>
-    <w:p>
-      <w:r>
-        <w:rPr>
-          <w:rFonts w:ascii="Consolas" w:hAnsi="Consolas"/>
-          <w:sz w:val="18"/>
-        </w:rPr>
-        <w:t xml:space="preserve">      FROM securityclearance</w:t>
-      </w:r>
-    </w:p>
-    <w:p>
-      <w:r>
-        <w:rPr>
-          <w:rFonts w:ascii="Consolas" w:hAnsi="Consolas"/>
-          <w:sz w:val="18"/>
-        </w:rPr>
-        <w:t xml:space="preserve">      WHERE sc_level = 'Top Secret'</w:t>
-      </w:r>
-    </w:p>
-    <w:p>
-      <w:r>
-        <w:rPr>
-          <w:rFonts w:ascii="Consolas" w:hAnsi="Consolas"/>
-          <w:sz w:val="18"/>
-        </w:rPr>
-        <w:t xml:space="preserve">    )</w:t>
-      </w:r>
-    </w:p>
-    <w:p>
-      <w:r>
-        <w:rPr>
-          <w:rFonts w:ascii="Consolas" w:hAnsi="Consolas"/>
-          <w:sz w:val="18"/>
-        </w:rPr>
-        <w:t xml:space="preserve">    AND lower(m.mission_status) = 'failed'</w:t>
-      </w:r>
-    </w:p>
-    <w:p>
-      <w:r>
-        <w:rPr>
-          <w:rFonts w:ascii="Consolas" w:hAnsi="Consolas"/>
-          <w:sz w:val="18"/>
+        <w:t xml:space="preserve">    FROM spy.mission AS m</w:t>
+      </w:r>
+    </w:p>
+    <w:p>
+      <w:r>
+        <w:rPr>
+          <w:rFonts w:ascii="Consolas" w:hAnsi="Consolas"/>
+          <w:sz w:val="18"/>
+        </w:rPr>
+        <w:t xml:space="preserve">    INNER JOIN spy.securityclearance AS sc</w:t>
+      </w:r>
+    </w:p>
+    <w:p>
+      <w:r>
+        <w:rPr>
+          <w:rFonts w:ascii="Calibri" w:hAnsi="Calibri"/>
+          <w:sz w:val="22"/>
+        </w:rPr>
+        <w:t xml:space="preserve">      ON m.access_id = sc.sc_id</w:t>
+      </w:r>
+    </w:p>
+    <w:p>
+      <w:r>
+        <w:rPr>
+          <w:rFonts w:ascii="Consolas" w:hAnsi="Consolas"/>
+          <w:sz w:val="18"/>
+        </w:rPr>
+        <w:t xml:space="preserve">    WHERE sc.sc_level = 'Top Secret'</w:t>
+      </w:r>
+    </w:p>
+    <w:p>
+      <w:r>
+        <w:rPr>
+          <w:rFonts w:ascii="Calibri" w:hAnsi="Calibri"/>
+          <w:sz w:val="22"/>
+        </w:rPr>
+        <w:t xml:space="preserve">      AND lower(m.mission_status) = 'failed'</w:t>
+      </w:r>
+    </w:p>
+    <w:p>
+      <w:r>
+        <w:rPr>
+          <w:rFonts w:ascii="Calibri" w:hAnsi="Calibri"/>
+          <w:sz w:val="22"/>
         </w:rPr>
         <w:t xml:space="preserve">  )</w:t>
       </w:r>
@@ -2106,8 +2069,8 @@
     <w:p>
       <w:r>
         <w:rPr>
-          <w:rFonts w:ascii="Consolas" w:hAnsi="Consolas"/>
-          <w:sz w:val="18"/>
+          <w:rFonts w:ascii="Calibri" w:hAnsi="Calibri"/>
+          <w:sz w:val="22"/>
         </w:rPr>
       </w:r>
     </w:p>
@@ -2143,15 +2106,52 @@
           <w:rFonts w:ascii="Calibri" w:hAnsi="Calibri"/>
           <w:sz w:val="22"/>
         </w:rPr>
-        <w:t>Note: If your data uses a different status spelling, adjust the failed filter (for example 'Failed').</w:t>
-      </w:r>
-    </w:p>
-    <w:p>
-      <w:r>
-        <w:rPr>
-          <w:rFonts w:ascii="Calibri" w:hAnsi="Calibri"/>
-          <w:sz w:val="22"/>
-        </w:rPr>
+        <w:t>Answer 8:</w:t>
+      </w:r>
+    </w:p>
+    <w:p>
+      <w:r>
+        <w:rPr>
+          <w:rFonts w:ascii="Calibri" w:hAnsi="Calibri"/>
+          <w:sz w:val="22"/>
+        </w:rPr>
+        <w:t>SQL (subquery) — spy.language and spy.languagerel (lang_id, agent_id) from ERD:</w:t>
+      </w:r>
+    </w:p>
+    <w:p>
+      <w:r>
+        <w:rPr>
+          <w:rFonts w:ascii="Consolas" w:hAnsi="Consolas"/>
+          <w:sz w:val="18"/>
+        </w:rPr>
+        <w:t>SELECT l.language, COUNT(*) AS number_of_speakers</w:t>
+      </w:r>
+    </w:p>
+    <w:p>
+      <w:r>
+        <w:rPr>
+          <w:rFonts w:ascii="Consolas" w:hAnsi="Consolas"/>
+          <w:sz w:val="18"/>
+        </w:rPr>
+        <w:t>FROM spy.language AS l</w:t>
+      </w:r>
+    </w:p>
+    <w:p>
+      <w:r>
+        <w:rPr>
+          <w:rFonts w:ascii="Consolas" w:hAnsi="Consolas"/>
+          <w:sz w:val="18"/>
+        </w:rPr>
+        <w:t>INNER JOIN spy.languagerel AS lr ON l.lang_id = lr.lang_id</w:t>
+      </w:r>
+    </w:p>
+    <w:p>
+      <w:r>
+        <w:rPr>
+          <w:rFonts w:ascii="Consolas" w:hAnsi="Consolas"/>
+          <w:sz w:val="18"/>
+        </w:rPr>
+        <w:t>GROUP BY l.lang_id, l.language</w:t>
       </w:r>
     </w:p>
     <w:p>
@@ -2164,99 +2164,28 @@
       </w:pPr>
       <w:r>
         <w:rPr>
-          <w:rFonts w:ascii="Calibri" w:cs="Calibri" w:eastAsia="Calibri" w:hAnsi="Calibri"/>
-          <w:sz w:val="24"/>
-          <w:szCs w:val="24"/>
-          <w:rtl w:val="0"/>
-        </w:rPr>
-        <w:t xml:space="preserve">Find the language and number of speakers for the language or languages with the most speakers.</w:t>
-      </w:r>
-    </w:p>
-    <w:p>
-      <w:r>
-        <w:rPr>
-          <w:rFonts w:ascii="Calibri" w:hAnsi="Calibri"/>
-          <w:sz w:val="22"/>
-        </w:rPr>
-      </w:r>
-    </w:p>
-    <w:p>
-      <w:r>
-        <w:rPr>
-          <w:rFonts w:ascii="Calibri" w:hAnsi="Calibri"/>
+          <w:rFonts w:ascii="Consolas" w:cs="Calibri" w:eastAsia="Calibri" w:hAnsi="Consolas"/>
+          <w:sz w:val="18"/>
+          <w:szCs w:val="24"/>
+          <w:rtl w:val="0"/>
+        </w:rPr>
+        <w:t>HAVING COUNT(*) = (</w:t>
+      </w:r>
+    </w:p>
+    <w:p>
+      <w:r>
+        <w:rPr>
+          <w:rFonts w:ascii="Consolas" w:hAnsi="Consolas"/>
+          <w:sz w:val="18"/>
+        </w:rPr>
+        <w:t xml:space="preserve">  SELECT MAX(speaker_count)</w:t>
+      </w:r>
+    </w:p>
+    <w:p>
+      <w:r>
+        <w:rPr>
+          <w:rFonts w:ascii="Consolas" w:hAnsi="Consolas"/>
           <w:b/>
-          <w:sz w:val="22"/>
-        </w:rPr>
-        <w:t>Answer 8:</w:t>
-      </w:r>
-    </w:p>
-    <w:p>
-      <w:r>
-        <w:rPr>
-          <w:rFonts w:ascii="Calibri" w:hAnsi="Calibri"/>
-          <w:sz w:val="22"/>
-        </w:rPr>
-        <w:t>SQL (subquery):</w:t>
-      </w:r>
-    </w:p>
-    <w:p>
-      <w:r>
-        <w:rPr>
-          <w:rFonts w:ascii="Consolas" w:hAnsi="Consolas"/>
-          <w:sz w:val="18"/>
-        </w:rPr>
-        <w:t>SELECT l.language, COUNT(*) AS number_of_speakers</w:t>
-      </w:r>
-    </w:p>
-    <w:p>
-      <w:r>
-        <w:rPr>
-          <w:rFonts w:ascii="Consolas" w:hAnsi="Consolas"/>
-          <w:sz w:val="18"/>
-        </w:rPr>
-        <w:t>FROM language l</w:t>
-      </w:r>
-    </w:p>
-    <w:p>
-      <w:r>
-        <w:rPr>
-          <w:rFonts w:ascii="Consolas" w:hAnsi="Consolas"/>
-          <w:sz w:val="18"/>
-        </w:rPr>
-        <w:t>INNER JOIN languagerel lr ON l.lang_id = lr.lang_id</w:t>
-      </w:r>
-    </w:p>
-    <w:p>
-      <w:r>
-        <w:rPr>
-          <w:rFonts w:ascii="Consolas" w:hAnsi="Consolas"/>
-          <w:sz w:val="18"/>
-        </w:rPr>
-        <w:t>GROUP BY l.lang_id, l.language</w:t>
-      </w:r>
-    </w:p>
-    <w:p>
-      <w:r>
-        <w:rPr>
-          <w:rFonts w:ascii="Consolas" w:hAnsi="Consolas"/>
-          <w:sz w:val="18"/>
-        </w:rPr>
-        <w:t>HAVING COUNT(*) = (</w:t>
-      </w:r>
-    </w:p>
-    <w:p>
-      <w:r>
-        <w:rPr>
-          <w:rFonts w:ascii="Consolas" w:hAnsi="Consolas"/>
-          <w:sz w:val="18"/>
-        </w:rPr>
-        <w:t xml:space="preserve">  SELECT MAX(speaker_count)</w:t>
-      </w:r>
-    </w:p>
-    <w:p>
-      <w:r>
-        <w:rPr>
-          <w:rFonts w:ascii="Consolas" w:hAnsi="Consolas"/>
           <w:sz w:val="18"/>
         </w:rPr>
         <w:t xml:space="preserve">  FROM (</w:t>
@@ -2277,7 +2206,7 @@
           <w:rFonts w:ascii="Consolas" w:hAnsi="Consolas"/>
           <w:sz w:val="18"/>
         </w:rPr>
-        <w:t xml:space="preserve">    FROM languagerel</w:t>
+        <w:t xml:space="preserve">    FROM spy.languagerel</w:t>
       </w:r>
     </w:p>
     <w:p>
@@ -2292,8 +2221,8 @@
     <w:p>
       <w:r>
         <w:rPr>
-          <w:rFonts w:ascii="Consolas" w:hAnsi="Consolas"/>
-          <w:sz w:val="18"/>
+          <w:rFonts w:ascii="Calibri" w:hAnsi="Calibri"/>
+          <w:sz w:val="22"/>
         </w:rPr>
         <w:t xml:space="preserve">  ) AS counts_per_language</w:t>
       </w:r>
@@ -2310,8 +2239,8 @@
     <w:p>
       <w:r>
         <w:rPr>
-          <w:rFonts w:ascii="Consolas" w:hAnsi="Consolas"/>
-          <w:sz w:val="18"/>
+          <w:rFonts w:ascii="Calibri" w:hAnsi="Calibri"/>
+          <w:sz w:val="22"/>
         </w:rPr>
       </w:r>
     </w:p>
@@ -2347,7 +2276,71 @@
           <w:rFonts w:ascii="Calibri" w:hAnsi="Calibri"/>
           <w:sz w:val="22"/>
         </w:rPr>
-        <w:t>Explanation: Count agents per language, then keep only language(s) whose count equals the maximum.</w:t>
+        <w:t>Explanation: Each row in spy.languagerel links one agent_id to one lang_id; COUNT is number of agents per language.</w:t>
+      </w:r>
+    </w:p>
+    <w:p>
+      <w:r>
+        <w:rPr>
+          <w:rFonts w:ascii="Calibri" w:hAnsi="Calibri"/>
+          <w:sz w:val="22"/>
+        </w:rPr>
+      </w:r>
+    </w:p>
+    <w:p>
+      <w:r>
+        <w:rPr>
+          <w:rFonts w:ascii="Calibri" w:hAnsi="Calibri"/>
+          <w:sz w:val="22"/>
+        </w:rPr>
+      </w:r>
+    </w:p>
+    <w:p>
+      <w:r>
+        <w:rPr>
+          <w:rFonts w:ascii="Calibri" w:hAnsi="Calibri"/>
+          <w:sz w:val="22"/>
+        </w:rPr>
+      </w:r>
+    </w:p>
+    <w:p>
+      <w:r>
+        <w:rPr>
+          <w:rFonts w:ascii="Calibri" w:hAnsi="Calibri"/>
+          <w:sz w:val="22"/>
+        </w:rPr>
+      </w:r>
+    </w:p>
+    <w:p>
+      <w:r>
+        <w:rPr>
+          <w:rFonts w:ascii="Calibri" w:hAnsi="Calibri"/>
+          <w:sz w:val="22"/>
+        </w:rPr>
+      </w:r>
+    </w:p>
+    <w:p>
+      <w:r>
+        <w:rPr>
+          <w:rFonts w:ascii="Calibri" w:hAnsi="Calibri"/>
+          <w:sz w:val="22"/>
+        </w:rPr>
+      </w:r>
+    </w:p>
+    <w:p>
+      <w:r>
+        <w:rPr>
+          <w:rFonts w:ascii="Calibri" w:hAnsi="Calibri"/>
+          <w:sz w:val="22"/>
+        </w:rPr>
+      </w:r>
+    </w:p>
+    <w:p>
+      <w:r>
+        <w:rPr>
+          <w:rFonts w:ascii="Calibri" w:hAnsi="Calibri"/>
+          <w:sz w:val="22"/>
+        </w:rPr>
       </w:r>
     </w:p>
     <w:p>
@@ -2510,15 +2503,19 @@
         </w:rPr>
       </w:pPr>
       <w:r>
-        <w:rPr>
-          <w:rFonts w:ascii="Calibri" w:cs="Calibri" w:eastAsia="Calibri" w:hAnsi="Calibri"/>
+        <w:t>CREATE TABLE spy.newagent AS</w:t>
+      </w:r>
+    </w:p>
+    <w:p>
+      <w:pPr>
+        <w:spacing w:after="120" w:line="240" w:lineRule="auto"/>
+        <w:rPr>
+          <w:rFonts w:ascii="Roboto Mono" w:cs="Roboto Mono" w:eastAsia="Roboto Mono" w:hAnsi="Roboto Mono"/>
           <w:color w:val="37474f"/>
           <w:sz w:val="24"/>
           <w:szCs w:val="24"/>
-          <w:rtl w:val="0"/>
-        </w:rPr>
-        <w:t xml:space="preserve"></w:t>
-      </w:r>
+        </w:rPr>
+      </w:pPr>
       <w:r>
         <w:rPr>
           <w:rFonts w:ascii="Roboto Mono" w:cs="Roboto Mono" w:eastAsia="Roboto Mono" w:hAnsi="Roboto Mono"/>
@@ -2527,7 +2524,7 @@
           <w:szCs w:val="24"/>
           <w:rtl w:val="0"/>
         </w:rPr>
-        <w:t xml:space="preserve">CREATE TABLE </w:t>
+        <w:t xml:space="preserve">SELECT </w:t>
       </w:r>
       <w:r>
         <w:rPr>
@@ -2537,8 +2534,33 @@
           <w:szCs w:val="24"/>
           <w:rtl w:val="0"/>
         </w:rPr>
-        <w:t xml:space="preserve">newagent </w:t>
-      </w:r>
+        <w:t xml:space="preserve">*</w:t>
+      </w:r>
+    </w:p>
+    <w:p>
+      <w:pPr>
+        <w:spacing w:after="120" w:line="240" w:lineRule="auto"/>
+        <w:rPr>
+          <w:rFonts w:ascii="Roboto Mono" w:cs="Roboto Mono" w:eastAsia="Roboto Mono" w:hAnsi="Roboto Mono"/>
+          <w:color w:val="37474f"/>
+          <w:sz w:val="24"/>
+          <w:szCs w:val="24"/>
+        </w:rPr>
+      </w:pPr>
+      <w:r>
+        <w:t>FROM spy.agent</w:t>
+      </w:r>
+    </w:p>
+    <w:p>
+      <w:pPr>
+        <w:spacing w:after="120" w:line="240" w:lineRule="auto"/>
+        <w:rPr>
+          <w:rFonts w:ascii="Roboto Mono" w:cs="Roboto Mono" w:eastAsia="Roboto Mono" w:hAnsi="Roboto Mono"/>
+          <w:color w:val="37474f"/>
+          <w:sz w:val="24"/>
+          <w:szCs w:val="24"/>
+        </w:rPr>
+      </w:pPr>
       <w:r>
         <w:rPr>
           <w:rFonts w:ascii="Roboto Mono" w:cs="Roboto Mono" w:eastAsia="Roboto Mono" w:hAnsi="Roboto Mono"/>
@@ -2547,19 +2569,18 @@
           <w:szCs w:val="24"/>
           <w:rtl w:val="0"/>
         </w:rPr>
-        <w:t xml:space="preserve">AS</w:t>
-      </w:r>
-    </w:p>
-    <w:p>
-      <w:pPr>
-        <w:spacing w:after="120" w:line="240" w:lineRule="auto"/>
+        <w:t xml:space="preserve">WHERE TRUE </w:t>
+      </w:r>
+      <w:r>
         <w:rPr>
           <w:rFonts w:ascii="Roboto Mono" w:cs="Roboto Mono" w:eastAsia="Roboto Mono" w:hAnsi="Roboto Mono"/>
           <w:color w:val="37474f"/>
           <w:sz w:val="24"/>
           <w:szCs w:val="24"/>
-        </w:rPr>
-      </w:pPr>
+          <w:rtl w:val="0"/>
+        </w:rPr>
+        <w:t xml:space="preserve">= </w:t>
+      </w:r>
       <w:r>
         <w:rPr>
           <w:rFonts w:ascii="Roboto Mono" w:cs="Roboto Mono" w:eastAsia="Roboto Mono" w:hAnsi="Roboto Mono"/>
@@ -2568,7 +2589,7 @@
           <w:szCs w:val="24"/>
           <w:rtl w:val="0"/>
         </w:rPr>
-        <w:t xml:space="preserve">SELECT </w:t>
+        <w:t xml:space="preserve">FALSE</w:t>
       </w:r>
       <w:r>
         <w:rPr>
@@ -2578,89 +2599,36 @@
           <w:szCs w:val="24"/>
           <w:rtl w:val="0"/>
         </w:rPr>
-        <w:t xml:space="preserve">*</w:t>
-      </w:r>
-    </w:p>
-    <w:p>
-      <w:pPr>
-        <w:spacing w:after="120" w:line="240" w:lineRule="auto"/>
-        <w:rPr>
-          <w:rFonts w:ascii="Roboto Mono" w:cs="Roboto Mono" w:eastAsia="Roboto Mono" w:hAnsi="Roboto Mono"/>
+        <w:t xml:space="preserve">;</w:t>
+      </w:r>
+    </w:p>
+    <w:p>
+      <w:pPr>
+        <w:spacing w:after="240" w:before="240" w:line="240" w:lineRule="auto"/>
+        <w:rPr>
+          <w:rFonts w:ascii="Calibri" w:cs="Calibri" w:eastAsia="Calibri" w:hAnsi="Calibri"/>
+          <w:sz w:val="24"/>
+          <w:szCs w:val="24"/>
+        </w:rPr>
+      </w:pPr>
+      <w:r>
+        <w:rPr>
+          <w:rFonts w:ascii="Calibri" w:cs="Calibri" w:eastAsia="Calibri" w:hAnsi="Calibri"/>
           <w:color w:val="37474f"/>
           <w:sz w:val="24"/>
           <w:szCs w:val="24"/>
-        </w:rPr>
-      </w:pPr>
-      <w:r>
-        <w:rPr>
-          <w:rFonts w:ascii="Roboto Mono" w:cs="Roboto Mono" w:eastAsia="Roboto Mono" w:hAnsi="Roboto Mono"/>
-          <w:color w:val="1967d2"/>
-          <w:sz w:val="24"/>
-          <w:szCs w:val="24"/>
-          <w:rtl w:val="0"/>
-        </w:rPr>
-        <w:t xml:space="preserve">FROM </w:t>
-      </w:r>
-      <w:r>
-        <w:rPr>
-          <w:rFonts w:ascii="Roboto Mono" w:cs="Roboto Mono" w:eastAsia="Roboto Mono" w:hAnsi="Roboto Mono"/>
-          <w:color w:val="37474f"/>
-          <w:sz w:val="24"/>
-          <w:szCs w:val="24"/>
-          <w:rtl w:val="0"/>
-        </w:rPr>
-        <w:t xml:space="preserve">agent</w:t>
-      </w:r>
-    </w:p>
-    <w:p>
-      <w:pPr>
-        <w:spacing w:after="120" w:line="240" w:lineRule="auto"/>
-        <w:rPr>
-          <w:rFonts w:ascii="Roboto Mono" w:cs="Roboto Mono" w:eastAsia="Roboto Mono" w:hAnsi="Roboto Mono"/>
-          <w:color w:val="37474f"/>
-          <w:sz w:val="24"/>
-          <w:szCs w:val="24"/>
-        </w:rPr>
-      </w:pPr>
-      <w:r>
-        <w:rPr>
-          <w:rFonts w:ascii="Roboto Mono" w:cs="Roboto Mono" w:eastAsia="Roboto Mono" w:hAnsi="Roboto Mono"/>
-          <w:color w:val="1967d2"/>
-          <w:sz w:val="24"/>
-          <w:szCs w:val="24"/>
-          <w:rtl w:val="0"/>
-        </w:rPr>
-        <w:t xml:space="preserve">WHERE TRUE </w:t>
-      </w:r>
-      <w:r>
-        <w:rPr>
-          <w:rFonts w:ascii="Roboto Mono" w:cs="Roboto Mono" w:eastAsia="Roboto Mono" w:hAnsi="Roboto Mono"/>
-          <w:color w:val="37474f"/>
-          <w:sz w:val="24"/>
-          <w:szCs w:val="24"/>
-          <w:rtl w:val="0"/>
-        </w:rPr>
-        <w:t xml:space="preserve">= </w:t>
-      </w:r>
-      <w:r>
-        <w:rPr>
-          <w:rFonts w:ascii="Roboto Mono" w:cs="Roboto Mono" w:eastAsia="Roboto Mono" w:hAnsi="Roboto Mono"/>
-          <w:color w:val="1967d2"/>
-          <w:sz w:val="24"/>
-          <w:szCs w:val="24"/>
-          <w:rtl w:val="0"/>
-        </w:rPr>
-        <w:t xml:space="preserve">FALSE</w:t>
-      </w:r>
-      <w:r>
-        <w:rPr>
-          <w:rFonts w:ascii="Roboto Mono" w:cs="Roboto Mono" w:eastAsia="Roboto Mono" w:hAnsi="Roboto Mono"/>
-          <w:color w:val="37474f"/>
-          <w:sz w:val="24"/>
-          <w:szCs w:val="24"/>
-          <w:rtl w:val="0"/>
-        </w:rPr>
-        <w:t xml:space="preserve">;</w:t>
+          <w:rtl w:val="0"/>
+        </w:rPr>
+        <w:t xml:space="preserve"></w:t>
+      </w:r>
+      <w:r>
+        <w:rPr>
+          <w:rFonts w:ascii="Calibri" w:cs="Calibri" w:eastAsia="Calibri" w:hAnsi="Calibri"/>
+          <w:sz w:val="24"/>
+          <w:szCs w:val="24"/>
+          <w:rtl w:val="0"/>
+        </w:rPr>
+        <w:t xml:space="preserve">Answer the following:</w:t>
       </w:r>
     </w:p>
     <w:p>
@@ -2675,35 +2643,6 @@
       <w:r>
         <w:rPr>
           <w:rFonts w:ascii="Calibri" w:cs="Calibri" w:eastAsia="Calibri" w:hAnsi="Calibri"/>
-          <w:color w:val="37474f"/>
-          <w:sz w:val="24"/>
-          <w:szCs w:val="24"/>
-          <w:rtl w:val="0"/>
-        </w:rPr>
-        <w:t xml:space="preserve"></w:t>
-      </w:r>
-      <w:r>
-        <w:rPr>
-          <w:rFonts w:ascii="Calibri" w:cs="Calibri" w:eastAsia="Calibri" w:hAnsi="Calibri"/>
-          <w:sz w:val="24"/>
-          <w:szCs w:val="24"/>
-          <w:rtl w:val="0"/>
-        </w:rPr>
-        <w:t xml:space="preserve">Answer the following:</w:t>
-      </w:r>
-    </w:p>
-    <w:p>
-      <w:pPr>
-        <w:spacing w:after="240" w:before="240" w:line="240" w:lineRule="auto"/>
-        <w:rPr>
-          <w:rFonts w:ascii="Calibri" w:cs="Calibri" w:eastAsia="Calibri" w:hAnsi="Calibri"/>
-          <w:sz w:val="24"/>
-          <w:szCs w:val="24"/>
-        </w:rPr>
-      </w:pPr>
-      <w:r>
-        <w:rPr>
-          <w:rFonts w:ascii="Calibri" w:cs="Calibri" w:eastAsia="Calibri" w:hAnsi="Calibri"/>
           <w:sz w:val="24"/>
           <w:szCs w:val="24"/>
           <w:rtl w:val="0"/>
@@ -2731,11 +2670,7 @@
     </w:p>
     <w:p>
       <w:r>
-        <w:rPr>
-          <w:rFonts w:ascii="Calibri" w:hAnsi="Calibri"/>
-          <w:sz w:val="22"/>
-        </w:rPr>
-        <w:t>The statement creates a new table named newagent with the same column names and data types as agent, but with zero rows.</w:t>
+        <w:t>The statement creates spy.newagent with the same column names and data types as spy.agent, but with zero rows. From the Spy ERD, spy.agent has: agent_id, first, middle, last, address, city, country, salary, clearance_id — spy.newagent gets those nine columns with matching types and no data.</w:t>
       </w:r>
     </w:p>
     <w:p>
@@ -2804,11 +2739,7 @@
     </w:p>
     <w:p>
       <w:r>
-        <w:rPr>
-          <w:rFonts w:ascii="Calibri" w:hAnsi="Calibri"/>
-          <w:sz w:val="22"/>
-        </w:rPr>
-        <w:t>WHERE TRUE = FALSE is always false, so no rows from agent are copied. I get the column structure only (CREATE TABLE ... AS SELECT with an empty result).</w:t>
+        <w:t>WHERE TRUE = FALSE is always false, so no rows from spy.agent are copied. I get the column structure only (CREATE TABLE ... AS SELECT with an empty result).</w:t>
       </w:r>
     </w:p>
     <w:p>
@@ -2829,51 +2760,7 @@
         </w:rPr>
       </w:pPr>
       <w:r>
-        <w:rPr>
-          <w:rFonts w:ascii="Calibri" w:cs="Calibri" w:eastAsia="Calibri" w:hAnsi="Calibri"/>
-          <w:sz w:val="24"/>
-          <w:szCs w:val="24"/>
-          <w:rtl w:val="0"/>
-        </w:rPr>
-        <w:t xml:space="preserve">9c. Include a screenshot showing that </w:t>
-      </w:r>
-      <w:r>
-        <w:rPr>
-          <w:rFonts w:ascii="Courier New" w:cs="Courier New" w:eastAsia="Courier New" w:hAnsi="Courier New"/>
-          <w:color w:val="188038"/>
-          <w:sz w:val="24"/>
-          <w:szCs w:val="24"/>
-          <w:rtl w:val="0"/>
-        </w:rPr>
-        <w:t xml:space="preserve">newagent</w:t>
-      </w:r>
-      <w:r>
-        <w:rPr>
-          <w:rFonts w:ascii="Calibri" w:cs="Calibri" w:eastAsia="Calibri" w:hAnsi="Calibri"/>
-          <w:sz w:val="24"/>
-          <w:szCs w:val="24"/>
-          <w:rtl w:val="0"/>
-        </w:rPr>
-        <w:t xml:space="preserve"> has the same columns as </w:t>
-      </w:r>
-      <w:r>
-        <w:rPr>
-          <w:rFonts w:ascii="Courier New" w:cs="Courier New" w:eastAsia="Courier New" w:hAnsi="Courier New"/>
-          <w:color w:val="188038"/>
-          <w:sz w:val="24"/>
-          <w:szCs w:val="24"/>
-          <w:rtl w:val="0"/>
-        </w:rPr>
-        <w:t xml:space="preserve">agent</w:t>
-      </w:r>
-      <w:r>
-        <w:rPr>
-          <w:rFonts w:ascii="Calibri" w:cs="Calibri" w:eastAsia="Calibri" w:hAnsi="Calibri"/>
-          <w:sz w:val="24"/>
-          <w:szCs w:val="24"/>
-          <w:rtl w:val="0"/>
-        </w:rPr>
-        <w:t xml:space="preserve">.</w:t>
+        <w:t>9c. Include a screenshot showing that spy.newagent has the same columns as spy.agent.</w:t>
       </w:r>
     </w:p>
     <w:p>
@@ -2896,11 +2783,7 @@
     </w:p>
     <w:p>
       <w:r>
-        <w:rPr>
-          <w:rFonts w:ascii="Calibri" w:hAnsi="Calibri"/>
-          <w:sz w:val="22"/>
-        </w:rPr>
-        <w:t>[SCREENSHOT: \d agent and \d newagent in psql, or DBeaver column list for both tables showing matching columns]</w:t>
+        <w:t>[SCREENSHOT: \d spy.agent and \d spy.newagent in psql, or DBeaver column list for spy.agent and spy.newagent — show the nine columns above match (agent_id, first, middle, last, address, city, country, salary, clearance_id)]</w:t>
       </w:r>
     </w:p>
     <w:p>
@@ -2995,11 +2878,7 @@
     </w:p>
     <w:p>
       <w:r>
-        <w:rPr>
-          <w:rFonts w:ascii="Calibri" w:hAnsi="Calibri"/>
-          <w:sz w:val="22"/>
-        </w:rPr>
-        <w:t>No. CREATE TABLE ... AS SELECT copies columns and data types (and data if any), but it does not copy primary keys, foreign keys, unique constraints, indexes, or defaults from the source table. I would need ALTER TABLE statements to add those constraints to newagent if I wanted them.</w:t>
+        <w:t>No. CREATE TABLE ... AS SELECT copies columns and data types only; it does not copy constraints from spy.agent. On the ERD, spy.agent has a primary key on agent_id and a foreign key clearance_id -&gt; spy.securityclearance.sc_id — those are not recreated on spy.newagent unless I add them with ALTER TABLE.</w:t>
       </w:r>
     </w:p>
     <w:p>
@@ -3041,11 +2920,7 @@
     </w:p>
     <w:p>
       <w:r>
-        <w:rPr>
-          <w:rFonts w:ascii="Consolas" w:hAnsi="Consolas"/>
-          <w:sz w:val="18"/>
-        </w:rPr>
-        <w:t>DROP TABLE newagent;</w:t>
+        <w:t>DROP TABLE spy.newagent;</w:t>
       </w:r>
     </w:p>
     <w:p>
@@ -3084,34 +2959,7 @@
         </w:rPr>
       </w:pPr>
       <w:r>
-        <w:rPr>
-          <w:rFonts w:ascii="Calibri" w:cs="Calibri" w:eastAsia="Calibri" w:hAnsi="Calibri"/>
-          <w:color w:val="37474f"/>
-          <w:sz w:val="24"/>
-          <w:szCs w:val="24"/>
-          <w:rtl w:val="0"/>
-        </w:rPr>
-        <w:t xml:space="preserve"></w:t>
-      </w:r>
-      <w:r>
-        <w:rPr>
-          <w:rFonts w:ascii="Roboto Mono" w:cs="Roboto Mono" w:eastAsia="Roboto Mono" w:hAnsi="Roboto Mono"/>
-          <w:color w:val="1967d2"/>
-          <w:sz w:val="24"/>
-          <w:szCs w:val="24"/>
-          <w:rtl w:val="0"/>
-        </w:rPr>
-        <w:t xml:space="preserve">DROP TABLE </w:t>
-      </w:r>
-      <w:r>
-        <w:rPr>
-          <w:rFonts w:ascii="Roboto Mono" w:cs="Roboto Mono" w:eastAsia="Roboto Mono" w:hAnsi="Roboto Mono"/>
-          <w:color w:val="37474f"/>
-          <w:sz w:val="24"/>
-          <w:szCs w:val="24"/>
-          <w:rtl w:val="0"/>
-        </w:rPr>
-        <w:t xml:space="preserve">newagent;</w:t>
+        <w:t>DROP TABLE spy.newagent;</w:t>
       </w:r>
     </w:p>
     <w:p>

</xml_diff>